<commit_message>
Update 12 treinamento documents with corrected @variable templates
Replace all treinamento .docx files with updated versions containing
correct variable placeholders (@nome, @funcao, @dt_adm etc.)

Co-Authored-By: Claude Sonnet 4.6 <noreply@anthropic.com>
Claude-Session: https://claude.ai/code/session_01LwAj8TGtgApfFwmLmGjHH9
</commit_message>
<xml_diff>
--- a/modelos/01_treinamento_admissional.docx
+++ b/modelos/01_treinamento_admissional.docx
@@ -174,11 +174,25 @@
               </w:rPr>
               <w:t>Funcionário</w:t>
             </w:r>
-            <w:r>
-              <w:rPr>
-                <w:rFonts w:ascii="Arial" w:hAnsi="Arial" w:cs="Arial"/>
-              </w:rPr>
-              <w:t>:  @nome</w:t>
+            <w:proofErr w:type="gramStart"/>
+            <w:r>
+              <w:rPr>
+                <w:rFonts w:ascii="Arial" w:hAnsi="Arial" w:cs="Arial"/>
+              </w:rPr>
+              <w:t xml:space="preserve">:  </w:t>
+            </w:r>
+            <w:r>
+              <w:rPr>
+                <w:rFonts w:ascii="Arial" w:hAnsi="Arial" w:cs="Arial"/>
+              </w:rPr>
+              <w:t>{</w:t>
+            </w:r>
+            <w:proofErr w:type="gramEnd"/>
+            <w:r>
+              <w:rPr>
+                <w:rFonts w:ascii="Arial" w:hAnsi="Arial" w:cs="Arial"/>
+              </w:rPr>
+              <w:t>{NOME}}</w:t>
             </w:r>
           </w:p>
         </w:tc>
@@ -215,7 +229,7 @@
               <w:rPr>
                 <w:rFonts w:ascii="Arial" w:hAnsi="Arial" w:cs="Arial"/>
               </w:rPr>
-              <w:t>:  @matricula</w:t>
+              <w:t xml:space="preserve">:  </w:t>
             </w:r>
           </w:p>
         </w:tc>
@@ -257,7 +271,27 @@
               <w:rPr>
                 <w:rFonts w:ascii="Arial" w:hAnsi="Arial" w:cs="Arial"/>
               </w:rPr>
-              <w:t>:   @funcao</w:t>
+              <w:t>:</w:t>
+            </w:r>
+            <w:proofErr w:type="gramStart"/>
+            <w:r>
+              <w:rPr>
+                <w:rFonts w:ascii="Arial" w:hAnsi="Arial" w:cs="Arial"/>
+              </w:rPr>
+              <w:t xml:space="preserve">   </w:t>
+            </w:r>
+            <w:r>
+              <w:rPr>
+                <w:rFonts w:ascii="Arial" w:hAnsi="Arial" w:cs="Arial"/>
+              </w:rPr>
+              <w:t>{</w:t>
+            </w:r>
+            <w:proofErr w:type="gramEnd"/>
+            <w:r>
+              <w:rPr>
+                <w:rFonts w:ascii="Arial" w:hAnsi="Arial" w:cs="Arial"/>
+              </w:rPr>
+              <w:t>{CARGO}}</w:t>
             </w:r>
           </w:p>
         </w:tc>
@@ -295,11 +329,25 @@
               </w:rPr>
               <w:t>Admissão</w:t>
             </w:r>
-            <w:r>
-              <w:rPr>
-                <w:rFonts w:ascii="Arial" w:hAnsi="Arial" w:cs="Arial"/>
-              </w:rPr>
-              <w:t>:  @dt_adm</w:t>
+            <w:proofErr w:type="gramStart"/>
+            <w:r>
+              <w:rPr>
+                <w:rFonts w:ascii="Arial" w:hAnsi="Arial" w:cs="Arial"/>
+              </w:rPr>
+              <w:t xml:space="preserve">:  </w:t>
+            </w:r>
+            <w:r>
+              <w:rPr>
+                <w:rFonts w:ascii="Arial" w:hAnsi="Arial" w:cs="Arial"/>
+              </w:rPr>
+              <w:t>{</w:t>
+            </w:r>
+            <w:proofErr w:type="gramEnd"/>
+            <w:r>
+              <w:rPr>
+                <w:rFonts w:ascii="Arial" w:hAnsi="Arial" w:cs="Arial"/>
+              </w:rPr>
+              <w:t>{DATA_ADMISSAO}}</w:t>
             </w:r>
           </w:p>
         </w:tc>
@@ -337,11 +385,25 @@
               </w:rPr>
               <w:t>Lotação</w:t>
             </w:r>
-            <w:r>
-              <w:rPr>
-                <w:rFonts w:ascii="Arial" w:hAnsi="Arial" w:cs="Arial"/>
-              </w:rPr>
-              <w:t>:  @lotacao</w:t>
+            <w:proofErr w:type="gramStart"/>
+            <w:r>
+              <w:rPr>
+                <w:rFonts w:ascii="Arial" w:hAnsi="Arial" w:cs="Arial"/>
+              </w:rPr>
+              <w:t xml:space="preserve">:  </w:t>
+            </w:r>
+            <w:r>
+              <w:rPr>
+                <w:rFonts w:ascii="Arial" w:hAnsi="Arial" w:cs="Arial"/>
+              </w:rPr>
+              <w:t>{</w:t>
+            </w:r>
+            <w:proofErr w:type="gramEnd"/>
+            <w:r>
+              <w:rPr>
+                <w:rFonts w:ascii="Arial" w:hAnsi="Arial" w:cs="Arial"/>
+              </w:rPr>
+              <w:t>{LOTACAO}}</w:t>
             </w:r>
           </w:p>
         </w:tc>
@@ -401,13 +463,19 @@
                 <w:b/>
                 <w:bCs/>
               </w:rPr>
-              <w:t xml:space="preserve">Nº CTPS:  </w:t>
-            </w:r>
-            <w:r>
-              <w:rPr>
-                <w:rFonts w:ascii="Arial" w:hAnsi="Arial" w:cs="Arial"/>
-              </w:rPr>
-              <w:t>@ctps</w:t>
+              <w:t>Nº CPF</w:t>
+            </w:r>
+            <w:r>
+              <w:rPr>
+                <w:rFonts w:ascii="Arial" w:hAnsi="Arial" w:cs="Arial"/>
+              </w:rPr>
+              <w:t xml:space="preserve">: </w:t>
+            </w:r>
+            <w:r>
+              <w:rPr>
+                <w:rFonts w:ascii="Arial" w:hAnsi="Arial" w:cs="Arial"/>
+              </w:rPr>
+              <w:t>{{CPF}}</w:t>
             </w:r>
           </w:p>
         </w:tc>
@@ -432,20 +500,6 @@
                 <w:szCs w:val="24"/>
               </w:rPr>
             </w:pPr>
-            <w:r>
-              <w:rPr>
-                <w:rFonts w:ascii="Arial" w:hAnsi="Arial" w:cs="Arial"/>
-                <w:b/>
-                <w:bCs/>
-              </w:rPr>
-              <w:t>Nº RG</w:t>
-            </w:r>
-            <w:r>
-              <w:rPr>
-                <w:rFonts w:ascii="Arial" w:hAnsi="Arial" w:cs="Arial"/>
-              </w:rPr>
-              <w:t>: @rg</w:t>
-            </w:r>
           </w:p>
         </w:tc>
         <w:tc>
@@ -475,13 +529,7 @@
                 <w:b/>
                 <w:bCs/>
               </w:rPr>
-              <w:t xml:space="preserve"> Nº CPF</w:t>
-            </w:r>
-            <w:r>
-              <w:rPr>
-                <w:rFonts w:ascii="Arial" w:hAnsi="Arial" w:cs="Arial"/>
-              </w:rPr>
-              <w:t>: @cpf</w:t>
+              <w:t xml:space="preserve"> </w:t>
             </w:r>
           </w:p>
         </w:tc>
@@ -1376,7 +1424,7 @@
                 <w:szCs w:val="18"/>
                 <w:shd w:val="clear" w:color="auto" w:fill="FFFFFF"/>
               </w:rPr>
-              <w:t>@nome</w:t>
+              <w:t>{{NOME}}</w:t>
             </w:r>
           </w:p>
         </w:tc>
@@ -1399,6 +1447,7 @@
                 <w:tab w:val="right" w:pos="5356"/>
               </w:tabs>
               <w:spacing w:before="60" w:after="60"/>
+              <w:jc w:val="center"/>
               <w:rPr>
                 <w:rFonts w:ascii="Arial" w:hAnsi="Arial" w:cs="Arial"/>
                 <w:sz w:val="18"/>
@@ -1413,32 +1462,7 @@
                 <w:szCs w:val="18"/>
                 <w:shd w:val="clear" w:color="auto" w:fill="FFFFFF"/>
               </w:rPr>
-              <w:tab/>
-            </w:r>
-            <w:r>
-              <w:rPr>
-                <w:rFonts w:ascii="Arial" w:hAnsi="Arial" w:cs="Arial"/>
-                <w:szCs w:val="24"/>
-                <w:shd w:val="clear" w:color="auto" w:fill="FFFFFF"/>
-              </w:rPr>
-              <w:t>@</w:t>
-            </w:r>
-            <w:r>
-              <w:rPr>
-                <w:rFonts w:ascii="Arial" w:hAnsi="Arial" w:cs="Arial"/>
-                <w:szCs w:val="24"/>
-                <w:shd w:val="clear" w:color="auto" w:fill="FFFFFF"/>
-              </w:rPr>
-              <w:t>resp_tecnico</w:t>
-            </w:r>
-            <w:r>
-              <w:rPr>
-                <w:rFonts w:ascii="Arial" w:hAnsi="Arial" w:cs="Arial"/>
-                <w:sz w:val="18"/>
-                <w:szCs w:val="18"/>
-                <w:shd w:val="clear" w:color="auto" w:fill="FFFFFF"/>
-              </w:rPr>
-              <w:tab/>
+              <w:t>{{RESP_SST}}</w:t>
             </w:r>
           </w:p>
         </w:tc>
@@ -1794,7 +1818,7 @@
         <v:path o:extrusionok="f" gradientshapeok="t" o:connecttype="rect"/>
         <o:lock v:ext="edit" aspectratio="t"/>
       </v:shapetype>
-      <v:shape id="_x0000_i1027" type="#_x0000_t75" style="width:11.25pt;height:11.25pt" o:bullet="t">
+      <v:shape id="_x0000_i1026" type="#_x0000_t75" style="width:11.2pt;height:11.2pt" o:bullet="t">
         <v:imagedata r:id="rId1" o:title="mso8E6E"/>
       </v:shape>
     </w:pict>
@@ -3276,7 +3300,6 @@
   <w:style w:type="character" w:default="1" w:styleId="Fontepargpadro">
     <w:name w:val="Default Paragraph Font"/>
     <w:uiPriority w:val="1"/>
-    <w:semiHidden/>
     <w:unhideWhenUsed/>
   </w:style>
   <w:style w:type="table" w:default="1" w:styleId="Tabelanormal">

</xml_diff>